<commit_message>
Orcamento - Liberação da empresa emissora, data vencimento e parcelamento quando orçamento já fechado, para edição
</commit_message>
<xml_diff>
--- a/uploads/Proposta/PropostaACESSO LOUNGE VIP - FACIAL_SET EXPO _.docx
+++ b/uploads/Proposta/PropostaACESSO LOUNGE VIP - FACIAL_SET EXPO _.docx
@@ -1057,7 +1057,7 @@
           <w:sz w:val="24"/>
           <w:szCs w:val="24"/>
         </w:rPr>
-        <w:t xml:space="preserve">• 3 Totem Completo, 4 Diária(s), de: 17/08/2026 até: 20/08/2026</w:t>
+        <w:t xml:space="preserve">• 3 Totem Completo, (FACIAL), 4 Diária(s), de: 17/08/2026 até: 20/08/2026</w:t>
       </w:r>
     </w:p>
     <w:p>
@@ -1332,7 +1332,7 @@
           <w:sz w:val="24"/>
           <w:szCs w:val="24"/>
         </w:rPr>
-        <w:t xml:space="preserve">R$ 27.204,00</w:t>
+        <w:t xml:space="preserve">R$ 20.000,00</w:t>
       </w:r>
       <w:r>
         <w:rPr>
@@ -1511,7 +1511,7 @@
           <w:i/>
           <w:iCs/>
         </w:rPr>
-        <w:t xml:space="preserve">30/06/2026</w:t>
+        <w:t xml:space="preserve">14/08/2026</w:t>
       </w:r>
     </w:p>
     <w:p>

</xml_diff>

<commit_message>
rotaMain - Correção nao Busca as informacoes de orcamentos com status R
</commit_message>
<xml_diff>
--- a/uploads/Proposta/PropostaACESSO LOUNGE VIP - FACIAL_SET EXPO _.docx
+++ b/uploads/Proposta/PropostaACESSO LOUNGE VIP - FACIAL_SET EXPO _.docx
@@ -1132,136 +1132,14 @@
     </w:p>
     <w:p>
       <w:pPr>
-        <w:rPr>
-          <w:rFonts w:ascii="Abel" w:hAnsi="Abel"/>
-          <w:sz w:val="24"/>
-          <w:szCs w:val="24"/>
-        </w:rPr>
-      </w:pPr>
-    </w:p>
-    <w:p>
-      <w:pPr>
-        <w:rPr>
-          <w:rFonts w:ascii="Abel" w:hAnsi="Abel"/>
-          <w:sz w:val="24"/>
-          <w:szCs w:val="24"/>
-        </w:rPr>
-      </w:pPr>
-    </w:p>
-    <w:p>
-      <w:pPr>
-        <w:rPr>
-          <w:rFonts w:ascii="Abel" w:hAnsi="Abel"/>
-          <w:sz w:val="24"/>
-          <w:szCs w:val="24"/>
-        </w:rPr>
-      </w:pPr>
-    </w:p>
-    <w:p>
-      <w:pPr>
-        <w:rPr>
-          <w:rFonts w:ascii="Abel" w:hAnsi="Abel"/>
-          <w:sz w:val="24"/>
-          <w:szCs w:val="24"/>
-        </w:rPr>
-      </w:pPr>
-    </w:p>
-    <w:p>
-      <w:pPr>
-        <w:rPr>
-          <w:rFonts w:ascii="Abel" w:hAnsi="Abel"/>
-          <w:sz w:val="24"/>
-          <w:szCs w:val="24"/>
-        </w:rPr>
-      </w:pPr>
-    </w:p>
-    <w:p>
-      <w:pPr>
-        <w:rPr>
-          <w:rFonts w:ascii="Abel" w:hAnsi="Abel"/>
-          <w:sz w:val="24"/>
-          <w:szCs w:val="24"/>
-        </w:rPr>
-      </w:pPr>
-    </w:p>
-    <w:p>
-      <w:pPr>
-        <w:rPr>
-          <w:rFonts w:ascii="Abel" w:hAnsi="Abel"/>
-          <w:sz w:val="24"/>
-          <w:szCs w:val="24"/>
-        </w:rPr>
-      </w:pPr>
-    </w:p>
-    <w:p>
-      <w:pPr>
-        <w:rPr>
-          <w:rFonts w:ascii="Abel" w:hAnsi="Abel"/>
-          <w:sz w:val="24"/>
-          <w:szCs w:val="24"/>
-        </w:rPr>
-      </w:pPr>
-    </w:p>
-    <w:p>
-      <w:pPr>
-        <w:rPr>
-          <w:rFonts w:ascii="Abel" w:hAnsi="Abel"/>
-          <w:sz w:val="24"/>
-          <w:szCs w:val="24"/>
-        </w:rPr>
-      </w:pPr>
-    </w:p>
-    <w:p>
-      <w:pPr>
-        <w:rPr>
-          <w:rFonts w:ascii="Abel" w:hAnsi="Abel"/>
-          <w:sz w:val="24"/>
-          <w:szCs w:val="24"/>
-        </w:rPr>
-      </w:pPr>
-    </w:p>
-    <w:p>
-      <w:pPr>
-        <w:rPr>
-          <w:rFonts w:ascii="Abel" w:hAnsi="Abel"/>
-          <w:sz w:val="24"/>
-          <w:szCs w:val="24"/>
-        </w:rPr>
-      </w:pPr>
-    </w:p>
-    <w:p>
-      <w:pPr>
-        <w:rPr>
-          <w:rFonts w:ascii="Abel" w:hAnsi="Abel"/>
-          <w:sz w:val="24"/>
-          <w:szCs w:val="24"/>
-        </w:rPr>
-      </w:pPr>
-    </w:p>
-    <w:p>
-      <w:pPr>
-        <w:pStyle w:val="PargrafodaLista"/>
         <w:spacing w:line="285" w:lineRule="atLeast"/>
-        <w:ind w:left="1065"/>
-        <w:rPr>
-          <w:rFonts w:ascii="Abel" w:hAnsi="Abel"/>
-          <w:sz w:val="24"/>
-          <w:szCs w:val="24"/>
-        </w:rPr>
-      </w:pPr>
-    </w:p>
-    <w:p>
-      <w:pPr>
-        <w:pStyle w:val="PargrafodaLista"/>
-        <w:spacing w:line="285" w:lineRule="atLeast"/>
-        <w:ind w:left="1065"/>
-      </w:pPr>
-    </w:p>
-    <w:p>
-      <w:pPr>
-        <w:pStyle w:val="PargrafodaLista"/>
-        <w:spacing w:line="285" w:lineRule="atLeast"/>
-        <w:ind w:left="0"/>
+        <w:rPr>
+          <w:rFonts w:ascii="Abel" w:hAnsi="Abel"/>
+          <w:sz w:val="24"/>
+          <w:szCs w:val="24"/>
+        </w:rPr>
+      </w:pPr>
+      <w:r>
         <w:rPr>
           <w:rFonts w:ascii="Abel" w:hAnsi="Abel"/>
           <w:b/>
@@ -1271,7 +1149,9 @@
           <w:sz w:val="24"/>
           <w:szCs w:val="24"/>
         </w:rPr>
-      </w:pPr>
+        <w:t xml:space="preserve">    ADICIONAIS</w:t>
+      </w:r>
+      <w:proofErr w:type="gramStart"/>
       <w:r>
         <w:rPr>
           <w:rFonts w:ascii="Abel" w:hAnsi="Abel"/>
@@ -1282,6 +1162,275 @@
           <w:sz w:val="24"/>
           <w:szCs w:val="24"/>
         </w:rPr>
+        <w:t>:</w:t>
+      </w:r>
+      <w:r>
+        <w:rPr>
+          <w:rFonts w:ascii="Abel" w:hAnsi="Abel"/>
+          <w:sz w:val="24"/>
+          <w:szCs w:val="24"/>
+        </w:rPr>
+        <w:t xml:space="preserve"/>
+      </w:r>
+    </w:p>
+    <w:p>
+      <w:pPr>
+        <w:pStyle w:val="PargrafodaLista"/>
+        <w:spacing w:line="285" w:lineRule="atLeast"/>
+        <w:ind w:left="0"/>
+        <w:rPr>
+          <w:rFonts w:ascii="Abel" w:hAnsi="Abel"/>
+          <w:sz w:val="24"/>
+          <w:szCs w:val="24"/>
+        </w:rPr>
+      </w:pPr>
+      <w:proofErr w:type="gramStart"/>
+      <w:r>
+        <w:rPr>
+          <w:rFonts w:ascii="Abel" w:hAnsi="Abel"/>
+          <w:sz w:val="24"/>
+          <w:szCs w:val="24"/>
+        </w:rPr>
+        <w:t xml:space="preserve">• 1 Recepcionista Mono</w:t>
+        <w:br/>
+        <w:t xml:space="preserve">        [Extra Bonificado], (BONIFICADO 2), 3 Diária(s), de: 18/08/2026 até: 20/08/2026</w:t>
+      </w:r>
+    </w:p>
+    <w:p>
+      <w:pPr>
+        <w:pStyle w:val="PargrafodaLista"/>
+        <w:spacing w:line="285" w:lineRule="atLeast"/>
+        <w:ind w:left="0"/>
+        <w:rPr>
+          <w:rFonts w:ascii="Abel" w:hAnsi="Abel"/>
+          <w:sz w:val="24"/>
+          <w:szCs w:val="24"/>
+        </w:rPr>
+      </w:pPr>
+      <w:r>
+        <w:rPr>
+          <w:rFonts w:ascii="Abel" w:hAnsi="Abel"/>
+          <w:sz w:val="24"/>
+          <w:szCs w:val="24"/>
+        </w:rPr>
+        <w:t xml:space="preserve"/>
+      </w:r>
+    </w:p>
+    <w:p>
+      <w:pPr>
+        <w:pStyle w:val="PargrafodaLista"/>
+        <w:spacing w:line="285" w:lineRule="atLeast"/>
+        <w:ind w:left="0"/>
+        <w:rPr>
+          <w:rFonts w:ascii="Abel" w:hAnsi="Abel"/>
+          <w:sz w:val="24"/>
+          <w:szCs w:val="24"/>
+        </w:rPr>
+      </w:pPr>
+      <w:proofErr w:type="gramStart"/>
+      <w:r>
+        <w:rPr>
+          <w:rFonts w:ascii="Abel" w:hAnsi="Abel"/>
+          <w:sz w:val="24"/>
+          <w:szCs w:val="24"/>
+        </w:rPr>
+        <w:t xml:space="preserve">• 1 Recepcionista Mono</w:t>
+        <w:br/>
+        <w:t xml:space="preserve">        [Extra Bonificado], (BONIFICADO), 3 Diária(s), de: 18/08/2026 até: 20/08/2026</w:t>
+      </w:r>
+    </w:p>
+    <w:p>
+      <w:pPr>
+        <w:pStyle w:val="PargrafodaLista"/>
+        <w:spacing w:line="285" w:lineRule="atLeast"/>
+        <w:ind w:left="0"/>
+        <w:rPr>
+          <w:rFonts w:ascii="Abel" w:hAnsi="Abel"/>
+          <w:sz w:val="24"/>
+          <w:szCs w:val="24"/>
+        </w:rPr>
+      </w:pPr>
+      <w:r>
+        <w:rPr>
+          <w:rFonts w:ascii="Abel" w:hAnsi="Abel"/>
+          <w:sz w:val="24"/>
+          <w:szCs w:val="24"/>
+        </w:rPr>
+        <w:t xml:space="preserve"/>
+      </w:r>
+    </w:p>
+    <w:p>
+      <w:pPr>
+        <w:pStyle w:val="PargrafodaLista"/>
+        <w:spacing w:line="285" w:lineRule="atLeast"/>
+        <w:ind w:left="0"/>
+        <w:rPr>
+          <w:rFonts w:ascii="Abel" w:hAnsi="Abel"/>
+          <w:sz w:val="24"/>
+          <w:szCs w:val="24"/>
+        </w:rPr>
+      </w:pPr>
+      <w:r>
+        <w:rPr>
+          <w:rFonts w:ascii="Abel" w:hAnsi="Abel"/>
+          <w:sz w:val="24"/>
+          <w:szCs w:val="24"/>
+        </w:rPr>
+        <w:t xml:space="preserve"/>
+      </w:r>
+    </w:p>
+    <w:p>
+      <w:pPr>
+        <w:rPr>
+          <w:rFonts w:ascii="Abel" w:hAnsi="Abel"/>
+          <w:sz w:val="24"/>
+          <w:szCs w:val="24"/>
+        </w:rPr>
+      </w:pPr>
+    </w:p>
+    <w:p>
+      <w:pPr>
+        <w:rPr>
+          <w:rFonts w:ascii="Abel" w:hAnsi="Abel"/>
+          <w:sz w:val="24"/>
+          <w:szCs w:val="24"/>
+        </w:rPr>
+      </w:pPr>
+    </w:p>
+    <w:p>
+      <w:pPr>
+        <w:rPr>
+          <w:rFonts w:ascii="Abel" w:hAnsi="Abel"/>
+          <w:sz w:val="24"/>
+          <w:szCs w:val="24"/>
+        </w:rPr>
+      </w:pPr>
+    </w:p>
+    <w:p>
+      <w:pPr>
+        <w:rPr>
+          <w:rFonts w:ascii="Abel" w:hAnsi="Abel"/>
+          <w:sz w:val="24"/>
+          <w:szCs w:val="24"/>
+        </w:rPr>
+      </w:pPr>
+    </w:p>
+    <w:p>
+      <w:pPr>
+        <w:rPr>
+          <w:rFonts w:ascii="Abel" w:hAnsi="Abel"/>
+          <w:sz w:val="24"/>
+          <w:szCs w:val="24"/>
+        </w:rPr>
+      </w:pPr>
+    </w:p>
+    <w:p>
+      <w:pPr>
+        <w:rPr>
+          <w:rFonts w:ascii="Abel" w:hAnsi="Abel"/>
+          <w:sz w:val="24"/>
+          <w:szCs w:val="24"/>
+        </w:rPr>
+      </w:pPr>
+    </w:p>
+    <w:p>
+      <w:pPr>
+        <w:rPr>
+          <w:rFonts w:ascii="Abel" w:hAnsi="Abel"/>
+          <w:sz w:val="24"/>
+          <w:szCs w:val="24"/>
+        </w:rPr>
+      </w:pPr>
+    </w:p>
+    <w:p>
+      <w:pPr>
+        <w:rPr>
+          <w:rFonts w:ascii="Abel" w:hAnsi="Abel"/>
+          <w:sz w:val="24"/>
+          <w:szCs w:val="24"/>
+        </w:rPr>
+      </w:pPr>
+    </w:p>
+    <w:p>
+      <w:pPr>
+        <w:rPr>
+          <w:rFonts w:ascii="Abel" w:hAnsi="Abel"/>
+          <w:sz w:val="24"/>
+          <w:szCs w:val="24"/>
+        </w:rPr>
+      </w:pPr>
+    </w:p>
+    <w:p>
+      <w:pPr>
+        <w:rPr>
+          <w:rFonts w:ascii="Abel" w:hAnsi="Abel"/>
+          <w:sz w:val="24"/>
+          <w:szCs w:val="24"/>
+        </w:rPr>
+      </w:pPr>
+    </w:p>
+    <w:p>
+      <w:pPr>
+        <w:rPr>
+          <w:rFonts w:ascii="Abel" w:hAnsi="Abel"/>
+          <w:sz w:val="24"/>
+          <w:szCs w:val="24"/>
+        </w:rPr>
+      </w:pPr>
+    </w:p>
+    <w:p>
+      <w:pPr>
+        <w:rPr>
+          <w:rFonts w:ascii="Abel" w:hAnsi="Abel"/>
+          <w:sz w:val="24"/>
+          <w:szCs w:val="24"/>
+        </w:rPr>
+      </w:pPr>
+    </w:p>
+    <w:p>
+      <w:pPr>
+        <w:pStyle w:val="PargrafodaLista"/>
+        <w:spacing w:line="285" w:lineRule="atLeast"/>
+        <w:ind w:left="1065"/>
+        <w:rPr>
+          <w:rFonts w:ascii="Abel" w:hAnsi="Abel"/>
+          <w:sz w:val="24"/>
+          <w:szCs w:val="24"/>
+        </w:rPr>
+      </w:pPr>
+    </w:p>
+    <w:p>
+      <w:pPr>
+        <w:pStyle w:val="PargrafodaLista"/>
+        <w:spacing w:line="285" w:lineRule="atLeast"/>
+        <w:ind w:left="1065"/>
+      </w:pPr>
+    </w:p>
+    <w:p>
+      <w:pPr>
+        <w:pStyle w:val="PargrafodaLista"/>
+        <w:spacing w:line="285" w:lineRule="atLeast"/>
+        <w:ind w:left="0"/>
+        <w:rPr>
+          <w:rFonts w:ascii="Abel" w:hAnsi="Abel"/>
+          <w:b/>
+          <w:bCs/>
+          <w:i/>
+          <w:iCs/>
+          <w:sz w:val="24"/>
+          <w:szCs w:val="24"/>
+        </w:rPr>
+      </w:pPr>
+      <w:r>
+        <w:rPr>
+          <w:rFonts w:ascii="Abel" w:hAnsi="Abel"/>
+          <w:b/>
+          <w:bCs/>
+          <w:i/>
+          <w:iCs/>
+          <w:sz w:val="24"/>
+          <w:szCs w:val="24"/>
+        </w:rPr>
         <w:lastRenderedPageBreak/>
         <w:t xml:space="preserve">INVESTIMENTO </w:t>
       </w:r>
@@ -1511,7 +1660,7 @@
           <w:i/>
           <w:iCs/>
         </w:rPr>
-        <w:t xml:space="preserve">14/08/2026</w:t>
+        <w:t xml:space="preserve">31/08/2026</w:t>
       </w:r>
     </w:p>
     <w:p>

</xml_diff>